<commit_message>
Add non-bitnami database, and handle entries
</commit_message>
<xml_diff>
--- a/docs/Village Show Guide.docx
+++ b/docs/Village Show Guide.docx
@@ -1173,16 +1173,8 @@
         <w:rPr>
           <w:color w:val="FF0000"/>
         </w:rPr>
-        <w:t xml:space="preserve">Only the </w:t>
-      </w:r>
-      <w:proofErr w:type="spellStart"/>
-      <w:r>
-        <w:rPr>
-          <w:color w:val="FF0000"/>
-        </w:rPr>
-        <w:t>ClassName</w:t>
-      </w:r>
-      <w:proofErr w:type="spellEnd"/>
+        <w:t>No</w:t>
+      </w:r>
       <w:r>
         <w:rPr>
           <w:color w:val="FF0000"/>
@@ -1233,7 +1225,6 @@
               <w:bottom w:val="nil"/>
               <w:right w:val="nil"/>
             </w:tcBorders>
-            <w:shd w:val="clear" w:color="auto" w:fill="auto"/>
             <w:noWrap/>
             <w:vAlign w:val="bottom"/>
             <w:hideMark/>
@@ -1266,7 +1257,6 @@
               <w:bottom w:val="nil"/>
               <w:right w:val="nil"/>
             </w:tcBorders>
-            <w:shd w:val="clear" w:color="auto" w:fill="auto"/>
             <w:noWrap/>
             <w:vAlign w:val="bottom"/>
             <w:hideMark/>
@@ -1299,7 +1289,6 @@
               <w:bottom w:val="nil"/>
               <w:right w:val="nil"/>
             </w:tcBorders>
-            <w:shd w:val="clear" w:color="auto" w:fill="auto"/>
             <w:noWrap/>
             <w:vAlign w:val="bottom"/>
             <w:hideMark/>
@@ -1332,7 +1321,6 @@
               <w:bottom w:val="nil"/>
               <w:right w:val="nil"/>
             </w:tcBorders>
-            <w:shd w:val="clear" w:color="auto" w:fill="auto"/>
             <w:noWrap/>
             <w:vAlign w:val="bottom"/>
             <w:hideMark/>
@@ -1365,7 +1353,6 @@
               <w:bottom w:val="nil"/>
               <w:right w:val="nil"/>
             </w:tcBorders>
-            <w:shd w:val="clear" w:color="auto" w:fill="auto"/>
             <w:noWrap/>
             <w:vAlign w:val="bottom"/>
             <w:hideMark/>
@@ -1398,7 +1385,6 @@
               <w:bottom w:val="nil"/>
               <w:right w:val="nil"/>
             </w:tcBorders>
-            <w:shd w:val="clear" w:color="auto" w:fill="auto"/>
             <w:noWrap/>
             <w:vAlign w:val="bottom"/>
             <w:hideMark/>
@@ -1431,7 +1417,6 @@
               <w:bottom w:val="nil"/>
               <w:right w:val="nil"/>
             </w:tcBorders>
-            <w:shd w:val="clear" w:color="auto" w:fill="auto"/>
             <w:noWrap/>
             <w:vAlign w:val="bottom"/>
             <w:hideMark/>
@@ -1464,7 +1449,6 @@
               <w:bottom w:val="nil"/>
               <w:right w:val="nil"/>
             </w:tcBorders>
-            <w:shd w:val="clear" w:color="auto" w:fill="auto"/>
             <w:noWrap/>
             <w:vAlign w:val="bottom"/>
             <w:hideMark/>
@@ -1502,7 +1486,6 @@
               <w:bottom w:val="nil"/>
               <w:right w:val="nil"/>
             </w:tcBorders>
-            <w:shd w:val="clear" w:color="auto" w:fill="auto"/>
             <w:noWrap/>
             <w:vAlign w:val="bottom"/>
             <w:hideMark/>
@@ -1537,7 +1520,6 @@
               <w:bottom w:val="nil"/>
               <w:right w:val="nil"/>
             </w:tcBorders>
-            <w:shd w:val="clear" w:color="auto" w:fill="auto"/>
             <w:noWrap/>
             <w:vAlign w:val="bottom"/>
             <w:hideMark/>
@@ -1570,7 +1552,6 @@
               <w:bottom w:val="nil"/>
               <w:right w:val="nil"/>
             </w:tcBorders>
-            <w:shd w:val="clear" w:color="auto" w:fill="auto"/>
             <w:noWrap/>
             <w:vAlign w:val="bottom"/>
             <w:hideMark/>
@@ -1603,7 +1584,6 @@
               <w:bottom w:val="nil"/>
               <w:right w:val="nil"/>
             </w:tcBorders>
-            <w:shd w:val="clear" w:color="auto" w:fill="auto"/>
             <w:noWrap/>
             <w:vAlign w:val="bottom"/>
             <w:hideMark/>
@@ -1636,7 +1616,6 @@
               <w:bottom w:val="nil"/>
               <w:right w:val="nil"/>
             </w:tcBorders>
-            <w:shd w:val="clear" w:color="auto" w:fill="auto"/>
             <w:noWrap/>
             <w:vAlign w:val="bottom"/>
             <w:hideMark/>
@@ -1669,7 +1648,6 @@
               <w:bottom w:val="nil"/>
               <w:right w:val="nil"/>
             </w:tcBorders>
-            <w:shd w:val="clear" w:color="auto" w:fill="auto"/>
             <w:noWrap/>
             <w:vAlign w:val="bottom"/>
             <w:hideMark/>
@@ -1694,7 +1672,6 @@
               <w:bottom w:val="nil"/>
               <w:right w:val="nil"/>
             </w:tcBorders>
-            <w:shd w:val="clear" w:color="auto" w:fill="auto"/>
             <w:noWrap/>
             <w:vAlign w:val="bottom"/>
             <w:hideMark/>
@@ -1725,7 +1702,6 @@
               <w:bottom w:val="nil"/>
               <w:right w:val="nil"/>
             </w:tcBorders>
-            <w:shd w:val="clear" w:color="auto" w:fill="auto"/>
             <w:noWrap/>
             <w:vAlign w:val="bottom"/>
             <w:hideMark/>
@@ -1760,7 +1736,6 @@
               <w:bottom w:val="nil"/>
               <w:right w:val="nil"/>
             </w:tcBorders>
-            <w:shd w:val="clear" w:color="auto" w:fill="auto"/>
             <w:noWrap/>
             <w:vAlign w:val="bottom"/>
             <w:hideMark/>
@@ -1793,7 +1768,6 @@
               <w:bottom w:val="nil"/>
               <w:right w:val="nil"/>
             </w:tcBorders>
-            <w:shd w:val="clear" w:color="auto" w:fill="auto"/>
             <w:noWrap/>
             <w:vAlign w:val="bottom"/>
             <w:hideMark/>
@@ -1826,7 +1800,6 @@
               <w:bottom w:val="nil"/>
               <w:right w:val="nil"/>
             </w:tcBorders>
-            <w:shd w:val="clear" w:color="auto" w:fill="auto"/>
             <w:noWrap/>
             <w:vAlign w:val="bottom"/>
             <w:hideMark/>
@@ -1859,7 +1832,6 @@
               <w:bottom w:val="nil"/>
               <w:right w:val="nil"/>
             </w:tcBorders>
-            <w:shd w:val="clear" w:color="auto" w:fill="auto"/>
             <w:noWrap/>
             <w:vAlign w:val="bottom"/>
             <w:hideMark/>
@@ -1892,7 +1864,6 @@
               <w:bottom w:val="nil"/>
               <w:right w:val="nil"/>
             </w:tcBorders>
-            <w:shd w:val="clear" w:color="auto" w:fill="auto"/>
             <w:noWrap/>
             <w:vAlign w:val="bottom"/>
             <w:hideMark/>
@@ -1925,7 +1896,6 @@
               <w:bottom w:val="nil"/>
               <w:right w:val="nil"/>
             </w:tcBorders>
-            <w:shd w:val="clear" w:color="auto" w:fill="auto"/>
             <w:noWrap/>
             <w:vAlign w:val="bottom"/>
             <w:hideMark/>
@@ -1956,7 +1926,6 @@
               <w:bottom w:val="nil"/>
               <w:right w:val="nil"/>
             </w:tcBorders>
-            <w:shd w:val="clear" w:color="auto" w:fill="auto"/>
             <w:noWrap/>
             <w:vAlign w:val="bottom"/>
           </w:tcPr>
@@ -1981,7 +1950,6 @@
               <w:bottom w:val="nil"/>
               <w:right w:val="nil"/>
             </w:tcBorders>
-            <w:shd w:val="clear" w:color="auto" w:fill="auto"/>
             <w:noWrap/>
             <w:vAlign w:val="bottom"/>
           </w:tcPr>
@@ -2005,7 +1973,6 @@
               <w:bottom w:val="nil"/>
               <w:right w:val="nil"/>
             </w:tcBorders>
-            <w:shd w:val="clear" w:color="auto" w:fill="auto"/>
             <w:noWrap/>
             <w:vAlign w:val="bottom"/>
           </w:tcPr>
@@ -2029,7 +1996,6 @@
               <w:bottom w:val="nil"/>
               <w:right w:val="nil"/>
             </w:tcBorders>
-            <w:shd w:val="clear" w:color="auto" w:fill="auto"/>
             <w:noWrap/>
             <w:vAlign w:val="bottom"/>
           </w:tcPr>
@@ -2053,7 +2019,6 @@
               <w:bottom w:val="nil"/>
               <w:right w:val="nil"/>
             </w:tcBorders>
-            <w:shd w:val="clear" w:color="auto" w:fill="auto"/>
             <w:noWrap/>
             <w:vAlign w:val="bottom"/>
           </w:tcPr>
@@ -2077,7 +2042,6 @@
               <w:bottom w:val="nil"/>
               <w:right w:val="nil"/>
             </w:tcBorders>
-            <w:shd w:val="clear" w:color="auto" w:fill="auto"/>
             <w:noWrap/>
             <w:vAlign w:val="bottom"/>
           </w:tcPr>
@@ -2101,7 +2065,6 @@
               <w:bottom w:val="nil"/>
               <w:right w:val="nil"/>
             </w:tcBorders>
-            <w:shd w:val="clear" w:color="auto" w:fill="auto"/>
             <w:noWrap/>
             <w:vAlign w:val="bottom"/>
           </w:tcPr>
@@ -2636,46 +2599,98 @@
     <w:p>
       <w:pPr>
         <w:pStyle w:val="Heading4"/>
-      </w:pPr>
-      <w:r>
+        <w:rPr>
+          <w:strike/>
+        </w:rPr>
+      </w:pPr>
+      <w:r>
+        <w:rPr>
+          <w:strike/>
+        </w:rPr>
         <w:lastRenderedPageBreak/>
+        <w:t xml:space="preserve">[Pre 2026] </w:t>
+      </w:r>
+      <w:r>
+        <w:rPr>
+          <w:strike/>
+        </w:rPr>
         <w:t>Generate the Entry Keys</w:t>
       </w:r>
     </w:p>
     <w:p>
-      <w:r>
+      <w:pPr>
+        <w:rPr>
+          <w:strike/>
+        </w:rPr>
+      </w:pPr>
+      <w:r>
+        <w:rPr>
+          <w:strike/>
+        </w:rPr>
         <w:t xml:space="preserve">Once all items have been entered then </w:t>
       </w:r>
       <w:r>
+        <w:rPr>
+          <w:strike/>
+        </w:rPr>
         <w:t xml:space="preserve">use the GENERATE ENTRY KEYS button to assign secret hashes to every entry.  These are the </w:t>
       </w:r>
       <w:r>
+        <w:rPr>
+          <w:strike/>
+        </w:rPr>
         <w:t xml:space="preserve">anonymous </w:t>
       </w:r>
       <w:r>
+        <w:rPr>
+          <w:strike/>
+        </w:rPr>
         <w:t xml:space="preserve">codes that will be </w:t>
       </w:r>
       <w:r>
-        <w:t xml:space="preserve">on the stickers for each entry, marked onto the judged forms, and entered </w:t>
-      </w:r>
-      <w:r>
-        <w:t>into the database.</w:t>
-      </w:r>
-    </w:p>
-    <w:p>
-      <w:pPr>
-        <w:rPr>
+        <w:rPr>
+          <w:strike/>
+        </w:rPr>
+        <w:t xml:space="preserve">on the stickers for each entry, marked onto the judged forms, and </w:t>
+      </w:r>
+      <w:proofErr w:type="gramStart"/>
+      <w:r>
+        <w:rPr>
+          <w:strike/>
+        </w:rPr>
+        <w:t xml:space="preserve">entered </w:t>
+      </w:r>
+      <w:r>
+        <w:rPr>
+          <w:strike/>
+        </w:rPr>
+        <w:t>into</w:t>
+      </w:r>
+      <w:proofErr w:type="gramEnd"/>
+      <w:r>
+        <w:rPr>
+          <w:strike/>
+        </w:rPr>
+        <w:t xml:space="preserve"> the database.</w:t>
+      </w:r>
+    </w:p>
+    <w:p>
+      <w:pPr>
+        <w:rPr>
+          <w:strike/>
           <w:color w:val="FF0000"/>
         </w:rPr>
       </w:pPr>
       <w:r>
         <w:rPr>
+          <w:strike/>
           <w:color w:val="FF0000"/>
         </w:rPr>
         <w:t>If additional changes are made (e.g. late entry forms), then the Keys will need to be reg</w:t>
       </w:r>
       <w:r>
         <w:rPr>
+          <w:strike/>
           <w:color w:val="FF0000"/>
         </w:rPr>
         <w:t>enerated.</w:t>
@@ -2684,17 +2699,20 @@
     <w:p>
       <w:pPr>
         <w:rPr>
+          <w:strike/>
           <w:color w:val="FF0000"/>
         </w:rPr>
       </w:pPr>
       <w:r>
         <w:rPr>
+          <w:strike/>
           <w:color w:val="FF0000"/>
         </w:rPr>
         <w:t>Key regeneration also wipes any existing judge entries (there shouldn’t be any</w:t>
       </w:r>
       <w:r>
         <w:rPr>
+          <w:strike/>
           <w:color w:val="FF0000"/>
         </w:rPr>
         <w:t xml:space="preserve"> at this stage)</w:t>
@@ -2841,6 +2859,55 @@
         <w:pStyle w:val="Heading4"/>
       </w:pPr>
       <w:r>
+        <w:t>Adjusting Entry</w:t>
+      </w:r>
+    </w:p>
+    <w:p>
+      <w:r>
+        <w:t xml:space="preserve">A user may request that their entry in class xx should be move to class </w:t>
+      </w:r>
+      <w:proofErr w:type="spellStart"/>
+      <w:r>
+        <w:t>yy</w:t>
+      </w:r>
+      <w:proofErr w:type="spellEnd"/>
+      <w:r>
+        <w:t>, a separate tab exists for that update</w:t>
+      </w:r>
+      <w:r>
+        <w:t>.</w:t>
+      </w:r>
+      <w:r>
+        <w:t xml:space="preserve">  Once adjusted, write the change to the label (i.e. the new class number and description, the entry Id remains unchanged)</w:t>
+      </w:r>
+    </w:p>
+    <w:p>
+      <w:pPr>
+        <w:pStyle w:val="Heading4"/>
+      </w:pPr>
+      <w:r>
+        <w:t xml:space="preserve">Adjusting </w:t>
+      </w:r>
+      <w:r>
+        <w:t>e</w:t>
+      </w:r>
+      <w:r>
+        <w:t>ntr</w:t>
+      </w:r>
+      <w:r>
+        <w:t>ies / Late entries</w:t>
+      </w:r>
+    </w:p>
+    <w:p>
+      <w:r>
+        <w:t>Edit/add the user information in the normal village page.  Then use the print selected villages to generate new files for labels and letters.</w:t>
+      </w:r>
+    </w:p>
+    <w:p>
+      <w:pPr>
+        <w:pStyle w:val="Heading4"/>
+      </w:pPr>
+      <w:r>
         <w:t>Judging</w:t>
       </w:r>
     </w:p>
@@ -2903,6 +2970,7 @@
     </w:p>
     <w:p>
       <w:r>
+        <w:lastRenderedPageBreak/>
         <w:t xml:space="preserve">The Judges page may also have a second entry card, this is where </w:t>
       </w:r>
       <w:r>
@@ -2948,7 +3016,6 @@
         </w:numPr>
       </w:pPr>
       <w:r>
-        <w:lastRenderedPageBreak/>
         <w:t>The certificate mail-merge source files (gold/silver/bronze.csv).</w:t>
       </w:r>
       <w:r>
@@ -3099,6 +3166,121 @@
       <w:r>
         <w:t>using nginx ingress.</w:t>
       </w:r>
+    </w:p>
+    <w:p>
+      <w:pPr>
+        <w:pStyle w:val="IntenseQuote"/>
+        <w:rPr>
+          <w:color w:val="auto"/>
+        </w:rPr>
+      </w:pPr>
+      <w:r>
+        <w:rPr>
+          <w:color w:val="auto"/>
+        </w:rPr>
+        <w:t xml:space="preserve">These instructions cover </w:t>
+      </w:r>
+      <w:proofErr w:type="spellStart"/>
+      <w:r>
+        <w:rPr>
+          <w:color w:val="auto"/>
+        </w:rPr>
+        <w:t>bitnami</w:t>
+      </w:r>
+      <w:proofErr w:type="spellEnd"/>
+      <w:r>
+        <w:rPr>
+          <w:color w:val="auto"/>
+        </w:rPr>
+        <w:t xml:space="preserve"> and non-</w:t>
+      </w:r>
+      <w:proofErr w:type="spellStart"/>
+      <w:r>
+        <w:rPr>
+          <w:color w:val="auto"/>
+        </w:rPr>
+        <w:t>bitnami</w:t>
+      </w:r>
+      <w:proofErr w:type="spellEnd"/>
+      <w:r>
+        <w:rPr>
+          <w:color w:val="auto"/>
+        </w:rPr>
+        <w:t xml:space="preserve"> based solutions.  The </w:t>
+      </w:r>
+      <w:proofErr w:type="spellStart"/>
+      <w:r>
+        <w:rPr>
+          <w:color w:val="auto"/>
+        </w:rPr>
+        <w:t>bitnami</w:t>
+      </w:r>
+      <w:proofErr w:type="spellEnd"/>
+      <w:r>
+        <w:rPr>
+          <w:color w:val="auto"/>
+        </w:rPr>
+        <w:t xml:space="preserve"> deploy is </w:t>
+      </w:r>
+      <w:proofErr w:type="gramStart"/>
+      <w:r>
+        <w:rPr>
+          <w:color w:val="auto"/>
+        </w:rPr>
+        <w:t>simpler, but</w:t>
+      </w:r>
+      <w:proofErr w:type="gramEnd"/>
+      <w:r>
+        <w:rPr>
+          <w:color w:val="auto"/>
+        </w:rPr>
+        <w:t xml:space="preserve"> is now behind a paywall.  Bitnami section will be in </w:t>
+      </w:r>
+      <w:r>
+        <w:rPr>
+          <w:color w:val="EE0000"/>
+        </w:rPr>
+        <w:t>red</w:t>
+      </w:r>
+      <w:r>
+        <w:rPr>
+          <w:color w:val="auto"/>
+        </w:rPr>
+        <w:t>, non-</w:t>
+      </w:r>
+      <w:proofErr w:type="spellStart"/>
+      <w:r>
+        <w:rPr>
+          <w:color w:val="auto"/>
+        </w:rPr>
+        <w:t>bitnami</w:t>
+      </w:r>
+      <w:proofErr w:type="spellEnd"/>
+      <w:r>
+        <w:rPr>
+          <w:color w:val="auto"/>
+        </w:rPr>
+        <w:t xml:space="preserve"> in </w:t>
+      </w:r>
+      <w:r>
+        <w:rPr>
+          <w:color w:val="00B0F0"/>
+        </w:rPr>
+        <w:t>blue</w:t>
+      </w:r>
+      <w:r>
+        <w:rPr>
+          <w:color w:val="auto"/>
+        </w:rPr>
+        <w:t>.</w:t>
+      </w:r>
+    </w:p>
+    <w:p>
+      <w:pPr>
+        <w:rPr>
+          <w:color w:val="EE0000"/>
+        </w:rPr>
+      </w:pPr>
     </w:p>
     <w:p>
       <w:pPr>
@@ -3239,6 +3421,7 @@
         <w:t xml:space="preserve"> as required)</w:t>
       </w:r>
     </w:p>
+    <w:p/>
     <w:p>
       <w:pPr>
         <w:pStyle w:val="Heading4"/>
@@ -3319,6 +3502,7 @@
     </w:p>
     <w:p>
       <w:r>
+        <w:lastRenderedPageBreak/>
         <w:t>This is probably not required, the Docker Desktop process should create it.</w:t>
       </w:r>
     </w:p>
@@ -3376,7 +3560,6 @@
     </w:p>
     <w:p>
       <w:r>
-        <w:lastRenderedPageBreak/>
         <w:t xml:space="preserve">In </w:t>
       </w:r>
       <w:proofErr w:type="spellStart"/>
@@ -3471,75 +3654,6 @@
       </w:r>
       <w:r>
         <w:br/>
-        <w:t>Set-</w:t>
-      </w:r>
-      <w:proofErr w:type="spellStart"/>
-      <w:r>
-        <w:t>ExecutionPolicy</w:t>
-      </w:r>
-      <w:proofErr w:type="spellEnd"/>
-      <w:r>
-        <w:t xml:space="preserve"> Bypass -Scope Process -Force; [</w:t>
-      </w:r>
-      <w:proofErr w:type="spellStart"/>
-      <w:r>
-        <w:t>System.Net.ServicePointManager</w:t>
-      </w:r>
-      <w:proofErr w:type="spellEnd"/>
-      <w:proofErr w:type="gramStart"/>
-      <w:r>
-        <w:t>]::</w:t>
-      </w:r>
-      <w:proofErr w:type="spellStart"/>
-      <w:proofErr w:type="gramEnd"/>
-      <w:r>
-        <w:t>SecurityProtocol</w:t>
-      </w:r>
-      <w:proofErr w:type="spellEnd"/>
-      <w:r>
-        <w:t xml:space="preserve"> = [</w:t>
-      </w:r>
-      <w:proofErr w:type="spellStart"/>
-      <w:r>
-        <w:t>System.Net.ServicePointManager</w:t>
-      </w:r>
-      <w:proofErr w:type="spellEnd"/>
-      <w:proofErr w:type="gramStart"/>
-      <w:r>
-        <w:t>]::</w:t>
-      </w:r>
-      <w:proofErr w:type="spellStart"/>
-      <w:proofErr w:type="gramEnd"/>
-      <w:r>
-        <w:t>SecurityProtocol</w:t>
-      </w:r>
-      <w:proofErr w:type="spellEnd"/>
-      <w:r>
-        <w:t xml:space="preserve"> -</w:t>
-      </w:r>
-      <w:proofErr w:type="spellStart"/>
-      <w:r>
-        <w:t>bor</w:t>
-      </w:r>
-      <w:proofErr w:type="spellEnd"/>
-      <w:r>
-        <w:t xml:space="preserve"> 3072; </w:t>
-      </w:r>
-      <w:proofErr w:type="spellStart"/>
-      <w:r>
-        <w:t>iex</w:t>
-      </w:r>
-      <w:proofErr w:type="spellEnd"/>
-      <w:r>
-        <w:t xml:space="preserve"> ((New-Object System.Net.WebClient</w:t>
-      </w:r>
-      <w:proofErr w:type="gramStart"/>
-      <w:r>
-        <w:t>).DownloadString</w:t>
-      </w:r>
-      <w:proofErr w:type="gramEnd"/>
-      <w:r>
-        <w:t>('https://community.chocolatey.org/install.ps1'))</w:t>
       </w:r>
     </w:p>
     <w:p>
@@ -3584,29 +3698,70 @@
       </w:r>
     </w:p>
     <w:p>
-      <w:r>
-        <w:t xml:space="preserve">helm </w:t>
+      <w:pPr>
+        <w:rPr>
+          <w:color w:val="EE0000"/>
+        </w:rPr>
+      </w:pPr>
+      <w:r>
+        <w:rPr>
+          <w:color w:val="EE0000"/>
+        </w:rPr>
+        <w:t>[</w:t>
+      </w:r>
+      <w:proofErr w:type="spellStart"/>
+      <w:r>
+        <w:rPr>
+          <w:color w:val="EE0000"/>
+        </w:rPr>
+        <w:t>bitnami</w:t>
+      </w:r>
+      <w:proofErr w:type="spellEnd"/>
+      <w:r>
+        <w:rPr>
+          <w:color w:val="EE0000"/>
+        </w:rPr>
+        <w:t xml:space="preserve">] </w:t>
+      </w:r>
+      <w:r>
+        <w:rPr>
+          <w:color w:val="EE0000"/>
+        </w:rPr>
+        <w:t xml:space="preserve">helm repo </w:t>
       </w:r>
       <w:proofErr w:type="gramStart"/>
       <w:r>
-        <w:t>repo</w:t>
+        <w:rPr>
+          <w:color w:val="EE0000"/>
+        </w:rPr>
+        <w:t>add</w:t>
       </w:r>
       <w:proofErr w:type="gramEnd"/>
       <w:r>
-        <w:t xml:space="preserve"> add </w:t>
-      </w:r>
-      <w:proofErr w:type="spellStart"/>
-      <w:r>
+        <w:rPr>
+          <w:color w:val="EE0000"/>
+        </w:rPr>
+        <w:t xml:space="preserve"> </w:t>
+      </w:r>
+      <w:proofErr w:type="spellStart"/>
+      <w:r>
+        <w:rPr>
+          <w:color w:val="EE0000"/>
+        </w:rPr>
         <w:t>bitnami</w:t>
       </w:r>
       <w:proofErr w:type="spellEnd"/>
       <w:r>
+        <w:rPr>
+          <w:color w:val="EE0000"/>
+        </w:rPr>
         <w:t xml:space="preserve"> </w:t>
       </w:r>
       <w:hyperlink r:id="rId17" w:history="1">
         <w:r>
           <w:rPr>
             <w:rStyle w:val="Hyperlink"/>
+            <w:color w:val="EE0000"/>
           </w:rPr>
           <w:t>https://charts.bitnami.com/bitnami</w:t>
         </w:r>
@@ -3818,6 +3973,7 @@
     <w:p>
       <w:proofErr w:type="spellStart"/>
       <w:r>
+        <w:lastRenderedPageBreak/>
         <w:t>kubectl</w:t>
       </w:r>
       <w:proofErr w:type="spellEnd"/>
@@ -3890,7 +4046,6 @@
     </w:p>
     <w:p>
       <w:r>
-        <w:lastRenderedPageBreak/>
         <w:t>cd /</w:t>
       </w:r>
       <w:proofErr w:type="spellStart"/>
@@ -3911,53 +4066,324 @@
       </w:r>
     </w:p>
     <w:p>
-      <w:r>
-        <w:t xml:space="preserve">helm install </w:t>
-      </w:r>
-      <w:proofErr w:type="spellStart"/>
-      <w:r>
+      <w:pPr>
+        <w:rPr>
+          <w:color w:val="EE0000"/>
+        </w:rPr>
+      </w:pPr>
+      <w:r>
+        <w:rPr>
+          <w:color w:val="EE0000"/>
+        </w:rPr>
+        <w:t>[</w:t>
+      </w:r>
+      <w:proofErr w:type="spellStart"/>
+      <w:r>
+        <w:rPr>
+          <w:color w:val="EE0000"/>
+        </w:rPr>
+        <w:t>bitnami</w:t>
+      </w:r>
+      <w:proofErr w:type="spellEnd"/>
+      <w:r>
+        <w:rPr>
+          <w:color w:val="EE0000"/>
+        </w:rPr>
+        <w:t xml:space="preserve">] </w:t>
+      </w:r>
+      <w:r>
+        <w:rPr>
+          <w:color w:val="EE0000"/>
+        </w:rPr>
+        <w:t xml:space="preserve">helm </w:t>
+      </w:r>
+      <w:proofErr w:type="gramStart"/>
+      <w:r>
+        <w:rPr>
+          <w:color w:val="EE0000"/>
+        </w:rPr>
+        <w:t>install</w:t>
+      </w:r>
+      <w:proofErr w:type="gramEnd"/>
+      <w:r>
+        <w:rPr>
+          <w:color w:val="EE0000"/>
+        </w:rPr>
+        <w:t xml:space="preserve"> </w:t>
+      </w:r>
+      <w:proofErr w:type="spellStart"/>
+      <w:r>
+        <w:rPr>
+          <w:color w:val="EE0000"/>
+        </w:rPr>
         <w:t>db</w:t>
       </w:r>
       <w:proofErr w:type="spellEnd"/>
       <w:r>
+        <w:rPr>
+          <w:color w:val="EE0000"/>
+        </w:rPr>
         <w:t xml:space="preserve"> </w:t>
       </w:r>
       <w:proofErr w:type="spellStart"/>
       <w:r>
+        <w:rPr>
+          <w:color w:val="EE0000"/>
+        </w:rPr>
         <w:t>bitnami</w:t>
       </w:r>
       <w:proofErr w:type="spellEnd"/>
       <w:r>
+        <w:rPr>
+          <w:color w:val="EE0000"/>
+        </w:rPr>
         <w:t>/</w:t>
       </w:r>
       <w:proofErr w:type="spellStart"/>
       <w:r>
+        <w:rPr>
+          <w:color w:val="EE0000"/>
+        </w:rPr>
         <w:t>postgresql</w:t>
       </w:r>
       <w:proofErr w:type="spellEnd"/>
       <w:r>
+        <w:rPr>
+          <w:color w:val="EE0000"/>
+        </w:rPr>
         <w:t xml:space="preserve"> -n </w:t>
       </w:r>
       <w:proofErr w:type="spellStart"/>
       <w:r>
+        <w:rPr>
+          <w:color w:val="EE0000"/>
+        </w:rPr>
         <w:t>vshow</w:t>
       </w:r>
       <w:proofErr w:type="spellEnd"/>
       <w:r>
+        <w:rPr>
+          <w:color w:val="EE0000"/>
+        </w:rPr>
         <w:t xml:space="preserve"> -f </w:t>
       </w:r>
       <w:proofErr w:type="spellStart"/>
       <w:r>
+        <w:rPr>
+          <w:color w:val="EE0000"/>
+        </w:rPr>
         <w:t>pg-</w:t>
       </w:r>
       <w:proofErr w:type="gramStart"/>
       <w:r>
+        <w:rPr>
+          <w:color w:val="EE0000"/>
+        </w:rPr>
         <w:t>values.yaml</w:t>
       </w:r>
       <w:proofErr w:type="spellEnd"/>
       <w:proofErr w:type="gramEnd"/>
     </w:p>
     <w:p>
+      <w:pPr>
+        <w:rPr>
+          <w:color w:val="0070C0"/>
+        </w:rPr>
+      </w:pPr>
+      <w:r>
+        <w:rPr>
+          <w:color w:val="0070C0"/>
+        </w:rPr>
+        <w:t>[non-</w:t>
+      </w:r>
+      <w:proofErr w:type="spellStart"/>
+      <w:r>
+        <w:rPr>
+          <w:color w:val="0070C0"/>
+        </w:rPr>
+        <w:t>bitnami</w:t>
+      </w:r>
+      <w:proofErr w:type="spellEnd"/>
+      <w:r>
+        <w:rPr>
+          <w:color w:val="0070C0"/>
+        </w:rPr>
+        <w:t xml:space="preserve">] </w:t>
+      </w:r>
+      <w:proofErr w:type="spellStart"/>
+      <w:r>
+        <w:rPr>
+          <w:color w:val="0070C0"/>
+        </w:rPr>
+        <w:t>kubectl</w:t>
+      </w:r>
+      <w:proofErr w:type="spellEnd"/>
+      <w:r>
+        <w:rPr>
+          <w:color w:val="0070C0"/>
+        </w:rPr>
+        <w:t xml:space="preserve"> apply -f </w:t>
+      </w:r>
+      <w:proofErr w:type="spellStart"/>
+      <w:r>
+        <w:rPr>
+          <w:color w:val="0070C0"/>
+        </w:rPr>
+        <w:t>pg-</w:t>
+      </w:r>
+      <w:proofErr w:type="gramStart"/>
+      <w:r>
+        <w:rPr>
+          <w:color w:val="0070C0"/>
+        </w:rPr>
+        <w:t>secret.yaml</w:t>
+      </w:r>
+      <w:proofErr w:type="spellEnd"/>
+      <w:proofErr w:type="gramEnd"/>
+      <w:r>
+        <w:rPr>
+          <w:color w:val="0070C0"/>
+        </w:rPr>
+        <w:br/>
+      </w:r>
+      <w:r>
+        <w:rPr>
+          <w:color w:val="0070C0"/>
+        </w:rPr>
+        <w:t>[non-</w:t>
+      </w:r>
+      <w:proofErr w:type="spellStart"/>
+      <w:r>
+        <w:rPr>
+          <w:color w:val="0070C0"/>
+        </w:rPr>
+        <w:t>bitnami</w:t>
+      </w:r>
+      <w:proofErr w:type="spellEnd"/>
+      <w:r>
+        <w:rPr>
+          <w:color w:val="0070C0"/>
+        </w:rPr>
+        <w:t xml:space="preserve">] </w:t>
+      </w:r>
+      <w:proofErr w:type="spellStart"/>
+      <w:r>
+        <w:rPr>
+          <w:color w:val="0070C0"/>
+        </w:rPr>
+        <w:t>kubectl</w:t>
+      </w:r>
+      <w:proofErr w:type="spellEnd"/>
+      <w:r>
+        <w:rPr>
+          <w:color w:val="0070C0"/>
+        </w:rPr>
+        <w:t xml:space="preserve"> apply -f </w:t>
+      </w:r>
+      <w:proofErr w:type="spellStart"/>
+      <w:r>
+        <w:rPr>
+          <w:color w:val="0070C0"/>
+        </w:rPr>
+        <w:t>pg-</w:t>
+      </w:r>
+      <w:proofErr w:type="gramStart"/>
+      <w:r>
+        <w:rPr>
+          <w:color w:val="0070C0"/>
+        </w:rPr>
+        <w:t>se</w:t>
+      </w:r>
+      <w:r>
+        <w:rPr>
+          <w:color w:val="0070C0"/>
+        </w:rPr>
+        <w:t>rvice</w:t>
+      </w:r>
+      <w:r>
+        <w:rPr>
+          <w:color w:val="0070C0"/>
+        </w:rPr>
+        <w:t>.yaml</w:t>
+      </w:r>
+      <w:proofErr w:type="spellEnd"/>
+      <w:proofErr w:type="gramEnd"/>
+      <w:r>
+        <w:rPr>
+          <w:color w:val="0070C0"/>
+        </w:rPr>
+        <w:br/>
+      </w:r>
+      <w:r>
+        <w:rPr>
+          <w:color w:val="0070C0"/>
+        </w:rPr>
+        <w:t>[non-</w:t>
+      </w:r>
+      <w:proofErr w:type="spellStart"/>
+      <w:r>
+        <w:rPr>
+          <w:color w:val="0070C0"/>
+        </w:rPr>
+        <w:t>bitnami</w:t>
+      </w:r>
+      <w:proofErr w:type="spellEnd"/>
+      <w:r>
+        <w:rPr>
+          <w:color w:val="0070C0"/>
+        </w:rPr>
+        <w:t xml:space="preserve">] </w:t>
+      </w:r>
+      <w:proofErr w:type="spellStart"/>
+      <w:r>
+        <w:rPr>
+          <w:color w:val="0070C0"/>
+        </w:rPr>
+        <w:t>kubectl</w:t>
+      </w:r>
+      <w:proofErr w:type="spellEnd"/>
+      <w:r>
+        <w:rPr>
+          <w:color w:val="0070C0"/>
+        </w:rPr>
+        <w:t xml:space="preserve"> apply -f </w:t>
+      </w:r>
+      <w:proofErr w:type="spellStart"/>
+      <w:r>
+        <w:rPr>
+          <w:color w:val="0070C0"/>
+        </w:rPr>
+        <w:t>pg-</w:t>
+      </w:r>
+      <w:proofErr w:type="gramStart"/>
+      <w:r>
+        <w:rPr>
+          <w:color w:val="0070C0"/>
+        </w:rPr>
+        <w:t>s</w:t>
+      </w:r>
+      <w:r>
+        <w:rPr>
+          <w:color w:val="0070C0"/>
+        </w:rPr>
+        <w:t>tatefulset</w:t>
+      </w:r>
+      <w:r>
+        <w:rPr>
+          <w:color w:val="0070C0"/>
+        </w:rPr>
+        <w:t>.yaml</w:t>
+      </w:r>
+      <w:proofErr w:type="spellEnd"/>
+      <w:proofErr w:type="gramEnd"/>
+    </w:p>
+    <w:p>
+      <w:r>
+        <w:rPr>
+          <w:color w:val="EE0000"/>
+        </w:rPr>
+        <w:br/>
+      </w:r>
       <w:r>
         <w:t xml:space="preserve"># After a while, check the </w:t>
       </w:r>
@@ -4219,6 +4645,7 @@
         <w:pStyle w:val="Heading4"/>
       </w:pPr>
       <w:r>
+        <w:lastRenderedPageBreak/>
         <w:t>Build the Village Show application</w:t>
       </w:r>
     </w:p>
@@ -4330,7 +4757,6 @@
     </w:p>
     <w:p>
       <w:r>
-        <w:lastRenderedPageBreak/>
         <w:t>cd /</w:t>
       </w:r>
       <w:proofErr w:type="spellStart"/>
@@ -4573,6 +4999,7 @@
     </w:p>
     <w:p>
       <w:r>
+        <w:lastRenderedPageBreak/>
         <w:t xml:space="preserve">In </w:t>
       </w:r>
       <w:proofErr w:type="spellStart"/>

</xml_diff>